<commit_message>
Update Task 1 documentation
</commit_message>
<xml_diff>
--- a/assignment4/Git_and_GitHub_Rajesh/Git_and_GitHub_Assignment_Rajesh.docx
+++ b/assignment4/Git_and_GitHub_Rajesh/Git_and_GitHub_Assignment_Rajesh.docx
@@ -893,6 +893,89 @@
     </w:p>
     <w:p>
       <w:pPr>
+        <w:pStyle w:val="Heading2"/>
+      </w:pPr>
+      <w:r>
+        <w:t>5. Merge into Main</w:t>
+      </w:r>
+    </w:p>
+    <w:p>
+      <w:r>
+        <w:t>I moved to main, pulled the latest changes, and merged my branch.</w:t>
+      </w:r>
+    </w:p>
+    <w:p>
+      <w:pPr>
+        <w:spacing w:after="80"/>
+        <w:ind w:left="360"/>
+      </w:pPr>
+      <w:r>
+        <w:rPr>
+          <w:rFonts w:ascii="Consolas" w:hAnsi="Consolas"/>
+          <w:sz w:val="18"/>
+        </w:rPr>
+        <w:t>git switch main</w:t>
+      </w:r>
+    </w:p>
+    <w:p>
+      <w:pPr>
+        <w:spacing w:after="80"/>
+        <w:ind w:left="360"/>
+      </w:pPr>
+      <w:r>
+        <w:rPr>
+          <w:rFonts w:ascii="Consolas" w:hAnsi="Consolas"/>
+          <w:sz w:val="18"/>
+        </w:rPr>
+        <w:t>git pull</w:t>
+      </w:r>
+    </w:p>
+    <w:p>
+      <w:pPr>
+        <w:spacing w:after="80"/>
+        <w:ind w:left="360"/>
+      </w:pPr>
+      <w:r>
+        <w:rPr>
+          <w:rFonts w:ascii="Consolas" w:hAnsi="Consolas"/>
+          <w:sz w:val="18"/>
+        </w:rPr>
+        <w:t>git merge RajeshReddy999 -m "Merge RajeshReddy999 branch into main"</w:t>
+      </w:r>
+    </w:p>
+    <w:p>
+      <w:pPr>
+        <w:spacing w:after="80"/>
+        <w:ind w:left="360"/>
+      </w:pPr>
+      <w:r>
+        <w:rPr>
+          <w:rFonts w:ascii="Consolas" w:hAnsi="Consolas"/>
+          <w:sz w:val="18"/>
+        </w:rPr>
+        <w:t>git log --oneline -6</w:t>
+      </w:r>
+    </w:p>
+    <w:p>
+      <w:pPr>
+        <w:spacing w:after="80"/>
+        <w:ind w:left="360"/>
+      </w:pPr>
+      <w:r>
+        <w:rPr>
+          <w:rFonts w:ascii="Consolas" w:hAnsi="Consolas"/>
+          <w:sz w:val="18"/>
+        </w:rPr>
+        <w:t>git push origin main</w:t>
+      </w:r>
+    </w:p>
+    <w:p>
+      <w:r>
+        <w:t>Result: The Flask project is now available in the main branch.</w:t>
+      </w:r>
+    </w:p>
+    <w:p>
+      <w:pPr>
         <w:pStyle w:val="Heading1"/>
       </w:pPr>
       <w:r>
@@ -901,7 +984,7 @@
     </w:p>
     <w:p>
       <w:r>
-        <w:t>Completed: SSH setup, SSH remote, username branch, and Flask project copy. The files are not committed yet.</w:t>
+        <w:t>Task 1 is complete. The next step is to create the RajeshReddy999_new branch and update the JSON file.</w:t>
       </w:r>
     </w:p>
     <w:sectPr>

</xml_diff>

<commit_message>
Add Task 1 screenshots to documentation
</commit_message>
<xml_diff>
--- a/assignment4/Git_and_GitHub_Rajesh/Git_and_GitHub_Assignment_Rajesh.docx
+++ b/assignment4/Git_and_GitHub_Rajesh/Git_and_GitHub_Assignment_Rajesh.docx
@@ -984,7 +984,632 @@
     </w:p>
     <w:p>
       <w:r>
-        <w:t>Task 1 is complete. The next step is to create the RajeshReddy999_new branch and update the JSON file.</w:t>
+        <w:t>Task 1 is complete. Task 2 has started with the RajeshReddy999_new branch.</w:t>
+      </w:r>
+    </w:p>
+    <w:p>
+      <w:pPr>
+        <w:pStyle w:val="Heading2"/>
+      </w:pPr>
+      <w:r>
+        <w:t>Flask Check</w:t>
+      </w:r>
+    </w:p>
+    <w:p>
+      <w:pPr>
+        <w:spacing w:before="80" w:after="40"/>
+        <w:jc w:val="center"/>
+      </w:pPr>
+      <w:r>
+        <w:drawing>
+          <wp:inline xmlns:a="http://schemas.openxmlformats.org/drawingml/2006/main" xmlns:pic="http://schemas.openxmlformats.org/drawingml/2006/picture">
+            <wp:extent cx="5577840" cy="741395"/>
+            <wp:docPr id="11" name="Picture 11"/>
+            <wp:cNvGraphicFramePr>
+              <a:graphicFrameLocks noChangeAspect="1"/>
+            </wp:cNvGraphicFramePr>
+            <a:graphic>
+              <a:graphicData uri="http://schemas.openxmlformats.org/drawingml/2006/picture">
+                <pic:pic>
+                  <pic:nvPicPr>
+                    <pic:cNvPr id="0" name="11_backend_running.png"/>
+                    <pic:cNvPicPr/>
+                  </pic:nvPicPr>
+                  <pic:blipFill>
+                    <a:blip r:embed="rId19"/>
+                    <a:stretch>
+                      <a:fillRect/>
+                    </a:stretch>
+                  </pic:blipFill>
+                  <pic:spPr>
+                    <a:xfrm>
+                      <a:off x="0" y="0"/>
+                      <a:ext cx="5577840" cy="741395"/>
+                    </a:xfrm>
+                    <a:prstGeom prst="rect"/>
+                  </pic:spPr>
+                </pic:pic>
+              </a:graphicData>
+            </a:graphic>
+          </wp:inline>
+        </w:drawing>
+      </w:r>
+    </w:p>
+    <w:p>
+      <w:pPr>
+        <w:spacing w:after="140"/>
+        <w:jc w:val="center"/>
+      </w:pPr>
+      <w:r>
+        <w:rPr>
+          <w:i/>
+          <w:sz w:val="18"/>
+        </w:rPr>
+        <w:t>Figure 11: Flask backend running</w:t>
+      </w:r>
+    </w:p>
+    <w:p>
+      <w:pPr>
+        <w:spacing w:before="80" w:after="40"/>
+        <w:jc w:val="center"/>
+      </w:pPr>
+      <w:r>
+        <w:drawing>
+          <wp:inline xmlns:a="http://schemas.openxmlformats.org/drawingml/2006/main" xmlns:pic="http://schemas.openxmlformats.org/drawingml/2006/picture">
+            <wp:extent cx="5577840" cy="2700101"/>
+            <wp:docPr id="12" name="Picture 12"/>
+            <wp:cNvGraphicFramePr>
+              <a:graphicFrameLocks noChangeAspect="1"/>
+            </wp:cNvGraphicFramePr>
+            <a:graphic>
+              <a:graphicData uri="http://schemas.openxmlformats.org/drawingml/2006/picture">
+                <pic:pic>
+                  <pic:nvPicPr>
+                    <pic:cNvPr id="0" name="12_api_output.png"/>
+                    <pic:cNvPicPr/>
+                  </pic:nvPicPr>
+                  <pic:blipFill>
+                    <a:blip r:embed="rId20"/>
+                    <a:stretch>
+                      <a:fillRect/>
+                    </a:stretch>
+                  </pic:blipFill>
+                  <pic:spPr>
+                    <a:xfrm>
+                      <a:off x="0" y="0"/>
+                      <a:ext cx="5577840" cy="2700101"/>
+                    </a:xfrm>
+                    <a:prstGeom prst="rect"/>
+                  </pic:spPr>
+                </pic:pic>
+              </a:graphicData>
+            </a:graphic>
+          </wp:inline>
+        </w:drawing>
+      </w:r>
+    </w:p>
+    <w:p>
+      <w:pPr>
+        <w:spacing w:after="140"/>
+        <w:jc w:val="center"/>
+      </w:pPr>
+      <w:r>
+        <w:rPr>
+          <w:i/>
+          <w:sz w:val="18"/>
+        </w:rPr>
+        <w:t>Figure 12: JSON output from /api</w:t>
+      </w:r>
+    </w:p>
+    <w:p>
+      <w:pPr>
+        <w:pStyle w:val="Heading2"/>
+      </w:pPr>
+      <w:r>
+        <w:t>First Commit and Merge</w:t>
+      </w:r>
+    </w:p>
+    <w:p>
+      <w:pPr>
+        <w:spacing w:before="80" w:after="40"/>
+        <w:jc w:val="center"/>
+      </w:pPr>
+      <w:r>
+        <w:drawing>
+          <wp:inline xmlns:a="http://schemas.openxmlformats.org/drawingml/2006/main" xmlns:pic="http://schemas.openxmlformats.org/drawingml/2006/picture">
+            <wp:extent cx="5577840" cy="2736791"/>
+            <wp:docPr id="13" name="Picture 13"/>
+            <wp:cNvGraphicFramePr>
+              <a:graphicFrameLocks noChangeAspect="1"/>
+            </wp:cNvGraphicFramePr>
+            <a:graphic>
+              <a:graphicData uri="http://schemas.openxmlformats.org/drawingml/2006/picture">
+                <pic:pic>
+                  <pic:nvPicPr>
+                    <pic:cNvPr id="0" name="13_files_staged.png"/>
+                    <pic:cNvPicPr/>
+                  </pic:nvPicPr>
+                  <pic:blipFill>
+                    <a:blip r:embed="rId21"/>
+                    <a:stretch>
+                      <a:fillRect/>
+                    </a:stretch>
+                  </pic:blipFill>
+                  <pic:spPr>
+                    <a:xfrm>
+                      <a:off x="0" y="0"/>
+                      <a:ext cx="5577840" cy="2736791"/>
+                    </a:xfrm>
+                    <a:prstGeom prst="rect"/>
+                  </pic:spPr>
+                </pic:pic>
+              </a:graphicData>
+            </a:graphic>
+          </wp:inline>
+        </w:drawing>
+      </w:r>
+    </w:p>
+    <w:p>
+      <w:pPr>
+        <w:spacing w:after="140"/>
+        <w:jc w:val="center"/>
+      </w:pPr>
+      <w:r>
+        <w:rPr>
+          <w:i/>
+          <w:sz w:val="18"/>
+        </w:rPr>
+        <w:t>Figure 13: Project files staged</w:t>
+      </w:r>
+    </w:p>
+    <w:p>
+      <w:pPr>
+        <w:spacing w:before="80" w:after="40"/>
+        <w:jc w:val="center"/>
+      </w:pPr>
+      <w:r>
+        <w:drawing>
+          <wp:inline xmlns:a="http://schemas.openxmlformats.org/drawingml/2006/main" xmlns:pic="http://schemas.openxmlformats.org/drawingml/2006/picture">
+            <wp:extent cx="5577840" cy="3492666"/>
+            <wp:docPr id="14" name="Picture 14"/>
+            <wp:cNvGraphicFramePr>
+              <a:graphicFrameLocks noChangeAspect="1"/>
+            </wp:cNvGraphicFramePr>
+            <a:graphic>
+              <a:graphicData uri="http://schemas.openxmlformats.org/drawingml/2006/picture">
+                <pic:pic>
+                  <pic:nvPicPr>
+                    <pic:cNvPr id="0" name="14_first_commit.png"/>
+                    <pic:cNvPicPr/>
+                  </pic:nvPicPr>
+                  <pic:blipFill>
+                    <a:blip r:embed="rId22"/>
+                    <a:stretch>
+                      <a:fillRect/>
+                    </a:stretch>
+                  </pic:blipFill>
+                  <pic:spPr>
+                    <a:xfrm>
+                      <a:off x="0" y="0"/>
+                      <a:ext cx="5577840" cy="3492666"/>
+                    </a:xfrm>
+                    <a:prstGeom prst="rect"/>
+                  </pic:spPr>
+                </pic:pic>
+              </a:graphicData>
+            </a:graphic>
+          </wp:inline>
+        </w:drawing>
+      </w:r>
+    </w:p>
+    <w:p>
+      <w:pPr>
+        <w:spacing w:after="140"/>
+        <w:jc w:val="center"/>
+      </w:pPr>
+      <w:r>
+        <w:rPr>
+          <w:i/>
+          <w:sz w:val="18"/>
+        </w:rPr>
+        <w:t>Figure 14: First project commit</w:t>
+      </w:r>
+    </w:p>
+    <w:p>
+      <w:pPr>
+        <w:spacing w:before="80" w:after="40"/>
+        <w:jc w:val="center"/>
+      </w:pPr>
+      <w:r>
+        <w:drawing>
+          <wp:inline xmlns:a="http://schemas.openxmlformats.org/drawingml/2006/main" xmlns:pic="http://schemas.openxmlformats.org/drawingml/2006/picture">
+            <wp:extent cx="5577840" cy="801687"/>
+            <wp:docPr id="15" name="Picture 15"/>
+            <wp:cNvGraphicFramePr>
+              <a:graphicFrameLocks noChangeAspect="1"/>
+            </wp:cNvGraphicFramePr>
+            <a:graphic>
+              <a:graphicData uri="http://schemas.openxmlformats.org/drawingml/2006/picture">
+                <pic:pic>
+                  <pic:nvPicPr>
+                    <pic:cNvPr id="0" name="15_first_commit_log.png"/>
+                    <pic:cNvPicPr/>
+                  </pic:nvPicPr>
+                  <pic:blipFill>
+                    <a:blip r:embed="rId23"/>
+                    <a:stretch>
+                      <a:fillRect/>
+                    </a:stretch>
+                  </pic:blipFill>
+                  <pic:spPr>
+                    <a:xfrm>
+                      <a:off x="0" y="0"/>
+                      <a:ext cx="5577840" cy="801687"/>
+                    </a:xfrm>
+                    <a:prstGeom prst="rect"/>
+                  </pic:spPr>
+                </pic:pic>
+              </a:graphicData>
+            </a:graphic>
+          </wp:inline>
+        </w:drawing>
+      </w:r>
+    </w:p>
+    <w:p>
+      <w:pPr>
+        <w:spacing w:after="140"/>
+        <w:jc w:val="center"/>
+      </w:pPr>
+      <w:r>
+        <w:rPr>
+          <w:i/>
+          <w:sz w:val="18"/>
+        </w:rPr>
+        <w:t>Figure 15: First commit in Git history</w:t>
+      </w:r>
+    </w:p>
+    <w:p>
+      <w:pPr>
+        <w:spacing w:before="80" w:after="40"/>
+        <w:jc w:val="center"/>
+      </w:pPr>
+      <w:r>
+        <w:drawing>
+          <wp:inline xmlns:a="http://schemas.openxmlformats.org/drawingml/2006/main" xmlns:pic="http://schemas.openxmlformats.org/drawingml/2006/picture">
+            <wp:extent cx="5577840" cy="2707766"/>
+            <wp:docPr id="16" name="Picture 16"/>
+            <wp:cNvGraphicFramePr>
+              <a:graphicFrameLocks noChangeAspect="1"/>
+            </wp:cNvGraphicFramePr>
+            <a:graphic>
+              <a:graphicData uri="http://schemas.openxmlformats.org/drawingml/2006/picture">
+                <pic:pic>
+                  <pic:nvPicPr>
+                    <pic:cNvPr id="0" name="16_username_branch_pushed.png"/>
+                    <pic:cNvPicPr/>
+                  </pic:nvPicPr>
+                  <pic:blipFill>
+                    <a:blip r:embed="rId24"/>
+                    <a:stretch>
+                      <a:fillRect/>
+                    </a:stretch>
+                  </pic:blipFill>
+                  <pic:spPr>
+                    <a:xfrm>
+                      <a:off x="0" y="0"/>
+                      <a:ext cx="5577840" cy="2707766"/>
+                    </a:xfrm>
+                    <a:prstGeom prst="rect"/>
+                  </pic:spPr>
+                </pic:pic>
+              </a:graphicData>
+            </a:graphic>
+          </wp:inline>
+        </w:drawing>
+      </w:r>
+    </w:p>
+    <w:p>
+      <w:pPr>
+        <w:spacing w:after="140"/>
+        <w:jc w:val="center"/>
+      </w:pPr>
+      <w:r>
+        <w:rPr>
+          <w:i/>
+          <w:sz w:val="18"/>
+        </w:rPr>
+        <w:t>Figure 16: Username branch pushed</w:t>
+      </w:r>
+    </w:p>
+    <w:p>
+      <w:pPr>
+        <w:spacing w:before="80" w:after="40"/>
+        <w:jc w:val="center"/>
+      </w:pPr>
+      <w:r>
+        <w:drawing>
+          <wp:inline xmlns:a="http://schemas.openxmlformats.org/drawingml/2006/main" xmlns:pic="http://schemas.openxmlformats.org/drawingml/2006/picture">
+            <wp:extent cx="5577840" cy="1162981"/>
+            <wp:docPr id="17" name="Picture 17"/>
+            <wp:cNvGraphicFramePr>
+              <a:graphicFrameLocks noChangeAspect="1"/>
+            </wp:cNvGraphicFramePr>
+            <a:graphic>
+              <a:graphicData uri="http://schemas.openxmlformats.org/drawingml/2006/picture">
+                <pic:pic>
+                  <pic:nvPicPr>
+                    <pic:cNvPr id="0" name="17_switched_to_main.png"/>
+                    <pic:cNvPicPr/>
+                  </pic:nvPicPr>
+                  <pic:blipFill>
+                    <a:blip r:embed="rId25"/>
+                    <a:stretch>
+                      <a:fillRect/>
+                    </a:stretch>
+                  </pic:blipFill>
+                  <pic:spPr>
+                    <a:xfrm>
+                      <a:off x="0" y="0"/>
+                      <a:ext cx="5577840" cy="1162981"/>
+                    </a:xfrm>
+                    <a:prstGeom prst="rect"/>
+                  </pic:spPr>
+                </pic:pic>
+              </a:graphicData>
+            </a:graphic>
+          </wp:inline>
+        </w:drawing>
+      </w:r>
+    </w:p>
+    <w:p>
+      <w:pPr>
+        <w:spacing w:after="140"/>
+        <w:jc w:val="center"/>
+      </w:pPr>
+      <w:r>
+        <w:rPr>
+          <w:i/>
+          <w:sz w:val="18"/>
+        </w:rPr>
+        <w:t>Figure 17: Switched to main</w:t>
+      </w:r>
+    </w:p>
+    <w:p>
+      <w:pPr>
+        <w:spacing w:before="80" w:after="40"/>
+        <w:jc w:val="center"/>
+      </w:pPr>
+      <w:r>
+        <w:drawing>
+          <wp:inline xmlns:a="http://schemas.openxmlformats.org/drawingml/2006/main" xmlns:pic="http://schemas.openxmlformats.org/drawingml/2006/picture">
+            <wp:extent cx="5577840" cy="3430318"/>
+            <wp:docPr id="18" name="Picture 18"/>
+            <wp:cNvGraphicFramePr>
+              <a:graphicFrameLocks noChangeAspect="1"/>
+            </wp:cNvGraphicFramePr>
+            <a:graphic>
+              <a:graphicData uri="http://schemas.openxmlformats.org/drawingml/2006/picture">
+                <pic:pic>
+                  <pic:nvPicPr>
+                    <pic:cNvPr id="0" name="18_username_branch_merged.png"/>
+                    <pic:cNvPicPr/>
+                  </pic:nvPicPr>
+                  <pic:blipFill>
+                    <a:blip r:embed="rId26"/>
+                    <a:stretch>
+                      <a:fillRect/>
+                    </a:stretch>
+                  </pic:blipFill>
+                  <pic:spPr>
+                    <a:xfrm>
+                      <a:off x="0" y="0"/>
+                      <a:ext cx="5577840" cy="3430318"/>
+                    </a:xfrm>
+                    <a:prstGeom prst="rect"/>
+                  </pic:spPr>
+                </pic:pic>
+              </a:graphicData>
+            </a:graphic>
+          </wp:inline>
+        </w:drawing>
+      </w:r>
+    </w:p>
+    <w:p>
+      <w:pPr>
+        <w:spacing w:after="140"/>
+        <w:jc w:val="center"/>
+      </w:pPr>
+      <w:r>
+        <w:rPr>
+          <w:i/>
+          <w:sz w:val="18"/>
+        </w:rPr>
+        <w:t>Figure 18: Username branch merged</w:t>
+      </w:r>
+    </w:p>
+    <w:p>
+      <w:pPr>
+        <w:spacing w:before="80" w:after="40"/>
+        <w:jc w:val="center"/>
+      </w:pPr>
+      <w:r>
+        <w:drawing>
+          <wp:inline xmlns:a="http://schemas.openxmlformats.org/drawingml/2006/main" xmlns:pic="http://schemas.openxmlformats.org/drawingml/2006/picture">
+            <wp:extent cx="5577840" cy="1344100"/>
+            <wp:docPr id="19" name="Picture 19"/>
+            <wp:cNvGraphicFramePr>
+              <a:graphicFrameLocks noChangeAspect="1"/>
+            </wp:cNvGraphicFramePr>
+            <a:graphic>
+              <a:graphicData uri="http://schemas.openxmlformats.org/drawingml/2006/picture">
+                <pic:pic>
+                  <pic:nvPicPr>
+                    <pic:cNvPr id="0" name="19_first_merge_history.png"/>
+                    <pic:cNvPicPr/>
+                  </pic:nvPicPr>
+                  <pic:blipFill>
+                    <a:blip r:embed="rId27"/>
+                    <a:stretch>
+                      <a:fillRect/>
+                    </a:stretch>
+                  </pic:blipFill>
+                  <pic:spPr>
+                    <a:xfrm>
+                      <a:off x="0" y="0"/>
+                      <a:ext cx="5577840" cy="1344100"/>
+                    </a:xfrm>
+                    <a:prstGeom prst="rect"/>
+                  </pic:spPr>
+                </pic:pic>
+              </a:graphicData>
+            </a:graphic>
+          </wp:inline>
+        </w:drawing>
+      </w:r>
+    </w:p>
+    <w:p>
+      <w:pPr>
+        <w:spacing w:after="140"/>
+        <w:jc w:val="center"/>
+      </w:pPr>
+      <w:r>
+        <w:rPr>
+          <w:i/>
+          <w:sz w:val="18"/>
+        </w:rPr>
+        <w:t>Figure 19: Git history after merge</w:t>
+      </w:r>
+    </w:p>
+    <w:p>
+      <w:pPr>
+        <w:spacing w:before="80" w:after="40"/>
+        <w:jc w:val="center"/>
+      </w:pPr>
+      <w:r>
+        <w:drawing>
+          <wp:inline xmlns:a="http://schemas.openxmlformats.org/drawingml/2006/main" xmlns:pic="http://schemas.openxmlformats.org/drawingml/2006/picture">
+            <wp:extent cx="5577840" cy="1193635"/>
+            <wp:docPr id="20" name="Picture 20"/>
+            <wp:cNvGraphicFramePr>
+              <a:graphicFrameLocks noChangeAspect="1"/>
+            </wp:cNvGraphicFramePr>
+            <a:graphic>
+              <a:graphicData uri="http://schemas.openxmlformats.org/drawingml/2006/picture">
+                <pic:pic>
+                  <pic:nvPicPr>
+                    <pic:cNvPr id="0" name="20_main_pushed_after_merge.png"/>
+                    <pic:cNvPicPr/>
+                  </pic:nvPicPr>
+                  <pic:blipFill>
+                    <a:blip r:embed="rId28"/>
+                    <a:stretch>
+                      <a:fillRect/>
+                    </a:stretch>
+                  </pic:blipFill>
+                  <pic:spPr>
+                    <a:xfrm>
+                      <a:off x="0" y="0"/>
+                      <a:ext cx="5577840" cy="1193635"/>
+                    </a:xfrm>
+                    <a:prstGeom prst="rect"/>
+                  </pic:spPr>
+                </pic:pic>
+              </a:graphicData>
+            </a:graphic>
+          </wp:inline>
+        </w:drawing>
+      </w:r>
+    </w:p>
+    <w:p>
+      <w:pPr>
+        <w:spacing w:after="140"/>
+        <w:jc w:val="center"/>
+      </w:pPr>
+      <w:r>
+        <w:rPr>
+          <w:i/>
+          <w:sz w:val="18"/>
+        </w:rPr>
+        <w:t>Figure 20: Main branch pushed</w:t>
+      </w:r>
+    </w:p>
+    <w:p>
+      <w:pPr>
+        <w:pStyle w:val="Heading1"/>
+      </w:pPr>
+      <w:r>
+        <w:t>Task 2 - New Branch</w:t>
+      </w:r>
+    </w:p>
+    <w:p>
+      <w:r>
+        <w:t>I created the RajeshReddy999_new branch from main.</w:t>
+      </w:r>
+    </w:p>
+    <w:p>
+      <w:pPr>
+        <w:spacing w:before="80" w:after="40"/>
+        <w:jc w:val="center"/>
+      </w:pPr>
+      <w:r>
+        <w:drawing>
+          <wp:inline xmlns:a="http://schemas.openxmlformats.org/drawingml/2006/main" xmlns:pic="http://schemas.openxmlformats.org/drawingml/2006/picture">
+            <wp:extent cx="5577840" cy="1469745"/>
+            <wp:docPr id="21" name="Picture 21"/>
+            <wp:cNvGraphicFramePr>
+              <a:graphicFrameLocks noChangeAspect="1"/>
+            </wp:cNvGraphicFramePr>
+            <a:graphic>
+              <a:graphicData uri="http://schemas.openxmlformats.org/drawingml/2006/picture">
+                <pic:pic>
+                  <pic:nvPicPr>
+                    <pic:cNvPr id="0" name="21_new_branch_created.png"/>
+                    <pic:cNvPicPr/>
+                  </pic:nvPicPr>
+                  <pic:blipFill>
+                    <a:blip r:embed="rId29"/>
+                    <a:stretch>
+                      <a:fillRect/>
+                    </a:stretch>
+                  </pic:blipFill>
+                  <pic:spPr>
+                    <a:xfrm>
+                      <a:off x="0" y="0"/>
+                      <a:ext cx="5577840" cy="1469745"/>
+                    </a:xfrm>
+                    <a:prstGeom prst="rect"/>
+                  </pic:spPr>
+                </pic:pic>
+              </a:graphicData>
+            </a:graphic>
+          </wp:inline>
+        </w:drawing>
+      </w:r>
+    </w:p>
+    <w:p>
+      <w:pPr>
+        <w:spacing w:after="140"/>
+        <w:jc w:val="center"/>
+      </w:pPr>
+      <w:r>
+        <w:rPr>
+          <w:i/>
+          <w:sz w:val="18"/>
+        </w:rPr>
+        <w:t>Figure 21: New branch created</w:t>
+      </w:r>
+    </w:p>
+    <w:p>
+      <w:pPr>
+        <w:pStyle w:val="Heading1"/>
+      </w:pPr>
+      <w:r>
+        <w:t>Current Progress</w:t>
+      </w:r>
+    </w:p>
+    <w:p>
+      <w:r>
+        <w:t>Task 1 is complete. The next step is to update the JSON file in RajeshReddy999_new.</w:t>
       </w:r>
     </w:p>
     <w:sectPr>

</xml_diff>

<commit_message>
Add Task 2 screenshots to documentation
</commit_message>
<xml_diff>
--- a/assignment4/Git_and_GitHub_Rajesh/Git_and_GitHub_Assignment_Rajesh.docx
+++ b/assignment4/Git_and_GitHub_Rajesh/Git_and_GitHub_Assignment_Rajesh.docx
@@ -1601,6 +1601,359 @@
     </w:p>
     <w:p>
       <w:pPr>
+        <w:pStyle w:val="Heading2"/>
+      </w:pPr>
+      <w:r>
+        <w:t>Update JSON and Resolve Conflict</w:t>
+      </w:r>
+    </w:p>
+    <w:p>
+      <w:r>
+        <w:t>I updated data.json in RajeshReddy999_new and committed the change.</w:t>
+      </w:r>
+    </w:p>
+    <w:p>
+      <w:pPr>
+        <w:spacing w:after="40"/>
+        <w:jc w:val="center"/>
+      </w:pPr>
+      <w:r>
+        <w:drawing>
+          <wp:inline xmlns:a="http://schemas.openxmlformats.org/drawingml/2006/main" xmlns:pic="http://schemas.openxmlformats.org/drawingml/2006/picture">
+            <wp:extent cx="5577840" cy="4046540"/>
+            <wp:docPr id="22" name="Picture 22"/>
+            <wp:cNvGraphicFramePr>
+              <a:graphicFrameLocks noChangeAspect="1"/>
+            </wp:cNvGraphicFramePr>
+            <a:graphic>
+              <a:graphicData uri="http://schemas.openxmlformats.org/drawingml/2006/picture">
+                <pic:pic>
+                  <pic:nvPicPr>
+                    <pic:cNvPr id="0" name="22_json_updated.png"/>
+                    <pic:cNvPicPr/>
+                  </pic:nvPicPr>
+                  <pic:blipFill>
+                    <a:blip r:embed="rId30"/>
+                    <a:stretch>
+                      <a:fillRect/>
+                    </a:stretch>
+                  </pic:blipFill>
+                  <pic:spPr>
+                    <a:xfrm>
+                      <a:off x="0" y="0"/>
+                      <a:ext cx="5577840" cy="4046540"/>
+                    </a:xfrm>
+                    <a:prstGeom prst="rect"/>
+                  </pic:spPr>
+                </pic:pic>
+              </a:graphicData>
+            </a:graphic>
+          </wp:inline>
+        </w:drawing>
+      </w:r>
+    </w:p>
+    <w:p>
+      <w:pPr>
+        <w:spacing w:after="140"/>
+        <w:jc w:val="center"/>
+      </w:pPr>
+      <w:r>
+        <w:rPr>
+          <w:i/>
+          <w:sz w:val="18"/>
+        </w:rPr>
+        <w:t>Figure 22: JSON file updated</w:t>
+      </w:r>
+    </w:p>
+    <w:p>
+      <w:pPr>
+        <w:spacing w:after="40"/>
+        <w:jc w:val="center"/>
+      </w:pPr>
+      <w:r>
+        <w:drawing>
+          <wp:inline xmlns:a="http://schemas.openxmlformats.org/drawingml/2006/main" xmlns:pic="http://schemas.openxmlformats.org/drawingml/2006/picture">
+            <wp:extent cx="5577840" cy="851579"/>
+            <wp:docPr id="23" name="Picture 23"/>
+            <wp:cNvGraphicFramePr>
+              <a:graphicFrameLocks noChangeAspect="1"/>
+            </wp:cNvGraphicFramePr>
+            <a:graphic>
+              <a:graphicData uri="http://schemas.openxmlformats.org/drawingml/2006/picture">
+                <pic:pic>
+                  <pic:nvPicPr>
+                    <pic:cNvPr id="0" name="23_new_branch_commits.png"/>
+                    <pic:cNvPicPr/>
+                  </pic:nvPicPr>
+                  <pic:blipFill>
+                    <a:blip r:embed="rId31"/>
+                    <a:stretch>
+                      <a:fillRect/>
+                    </a:stretch>
+                  </pic:blipFill>
+                  <pic:spPr>
+                    <a:xfrm>
+                      <a:off x="0" y="0"/>
+                      <a:ext cx="5577840" cy="851579"/>
+                    </a:xfrm>
+                    <a:prstGeom prst="rect"/>
+                  </pic:spPr>
+                </pic:pic>
+              </a:graphicData>
+            </a:graphic>
+          </wp:inline>
+        </w:drawing>
+      </w:r>
+    </w:p>
+    <w:p>
+      <w:pPr>
+        <w:spacing w:after="140"/>
+        <w:jc w:val="center"/>
+      </w:pPr>
+      <w:r>
+        <w:rPr>
+          <w:i/>
+          <w:sz w:val="18"/>
+        </w:rPr>
+        <w:t>Figure 23: Changes committed in the new branch</w:t>
+      </w:r>
+    </w:p>
+    <w:p>
+      <w:r>
+        <w:t>I changed the same JSON file in main. The merge then showed a conflict.</w:t>
+      </w:r>
+    </w:p>
+    <w:p>
+      <w:pPr>
+        <w:spacing w:after="80"/>
+        <w:ind w:left="360"/>
+      </w:pPr>
+      <w:r>
+        <w:rPr>
+          <w:rFonts w:ascii="Consolas" w:hAnsi="Consolas"/>
+          <w:sz w:val="18"/>
+        </w:rPr>
+        <w:t>git switch main</w:t>
+      </w:r>
+    </w:p>
+    <w:p>
+      <w:pPr>
+        <w:spacing w:after="80"/>
+        <w:ind w:left="360"/>
+      </w:pPr>
+      <w:r>
+        <w:rPr>
+          <w:rFonts w:ascii="Consolas" w:hAnsi="Consolas"/>
+          <w:sz w:val="18"/>
+        </w:rPr>
+        <w:t>git merge RajeshReddy999_new</w:t>
+      </w:r>
+    </w:p>
+    <w:p>
+      <w:pPr>
+        <w:spacing w:after="40"/>
+        <w:jc w:val="center"/>
+      </w:pPr>
+      <w:r>
+        <w:drawing>
+          <wp:inline xmlns:a="http://schemas.openxmlformats.org/drawingml/2006/main" xmlns:pic="http://schemas.openxmlformats.org/drawingml/2006/picture">
+            <wp:extent cx="5577840" cy="2236337"/>
+            <wp:docPr id="24" name="Picture 24"/>
+            <wp:cNvGraphicFramePr>
+              <a:graphicFrameLocks noChangeAspect="1"/>
+            </wp:cNvGraphicFramePr>
+            <a:graphic>
+              <a:graphicData uri="http://schemas.openxmlformats.org/drawingml/2006/picture">
+                <pic:pic>
+                  <pic:nvPicPr>
+                    <pic:cNvPr id="0" name="24_json_merge_conflict.png"/>
+                    <pic:cNvPicPr/>
+                  </pic:nvPicPr>
+                  <pic:blipFill>
+                    <a:blip r:embed="rId32"/>
+                    <a:stretch>
+                      <a:fillRect/>
+                    </a:stretch>
+                  </pic:blipFill>
+                  <pic:spPr>
+                    <a:xfrm>
+                      <a:off x="0" y="0"/>
+                      <a:ext cx="5577840" cy="2236337"/>
+                    </a:xfrm>
+                    <a:prstGeom prst="rect"/>
+                  </pic:spPr>
+                </pic:pic>
+              </a:graphicData>
+            </a:graphic>
+          </wp:inline>
+        </w:drawing>
+      </w:r>
+    </w:p>
+    <w:p>
+      <w:pPr>
+        <w:spacing w:after="140"/>
+        <w:jc w:val="center"/>
+      </w:pPr>
+      <w:r>
+        <w:rPr>
+          <w:i/>
+          <w:sz w:val="18"/>
+        </w:rPr>
+        <w:t>Figure 24: JSON merge conflict</w:t>
+      </w:r>
+    </w:p>
+    <w:p>
+      <w:r>
+        <w:t>I opened data.json in VS Code and accepted the incoming change from RajeshReddy999_new.</w:t>
+      </w:r>
+    </w:p>
+    <w:p>
+      <w:pPr>
+        <w:spacing w:after="80"/>
+        <w:ind w:left="360"/>
+      </w:pPr>
+      <w:r>
+        <w:rPr>
+          <w:rFonts w:ascii="Consolas" w:hAnsi="Consolas"/>
+          <w:sz w:val="18"/>
+        </w:rPr>
+        <w:t>git add assignment4/Git_and_GitHub_Rajesh/backend/data.json</w:t>
+      </w:r>
+    </w:p>
+    <w:p>
+      <w:pPr>
+        <w:spacing w:after="80"/>
+        <w:ind w:left="360"/>
+      </w:pPr>
+      <w:r>
+        <w:rPr>
+          <w:rFonts w:ascii="Consolas" w:hAnsi="Consolas"/>
+          <w:sz w:val="18"/>
+        </w:rPr>
+        <w:t>git commit -m "Resolve JSON conflict using new branch changes"</w:t>
+      </w:r>
+    </w:p>
+    <w:p>
+      <w:pPr>
+        <w:spacing w:after="80"/>
+        <w:ind w:left="360"/>
+      </w:pPr>
+      <w:r>
+        <w:rPr>
+          <w:rFonts w:ascii="Consolas" w:hAnsi="Consolas"/>
+          <w:sz w:val="18"/>
+        </w:rPr>
+        <w:t>git push origin main</w:t>
+      </w:r>
+    </w:p>
+    <w:p>
+      <w:pPr>
+        <w:spacing w:after="40"/>
+        <w:jc w:val="center"/>
+      </w:pPr>
+      <w:r>
+        <w:drawing>
+          <wp:inline xmlns:a="http://schemas.openxmlformats.org/drawingml/2006/main" xmlns:pic="http://schemas.openxmlformats.org/drawingml/2006/picture">
+            <wp:extent cx="5577840" cy="2074315"/>
+            <wp:docPr id="25" name="Picture 25"/>
+            <wp:cNvGraphicFramePr>
+              <a:graphicFrameLocks noChangeAspect="1"/>
+            </wp:cNvGraphicFramePr>
+            <a:graphic>
+              <a:graphicData uri="http://schemas.openxmlformats.org/drawingml/2006/picture">
+                <pic:pic>
+                  <pic:nvPicPr>
+                    <pic:cNvPr id="0" name="25_json_conflict_resolved.png"/>
+                    <pic:cNvPicPr/>
+                  </pic:nvPicPr>
+                  <pic:blipFill>
+                    <a:blip r:embed="rId33"/>
+                    <a:stretch>
+                      <a:fillRect/>
+                    </a:stretch>
+                  </pic:blipFill>
+                  <pic:spPr>
+                    <a:xfrm>
+                      <a:off x="0" y="0"/>
+                      <a:ext cx="5577840" cy="2074315"/>
+                    </a:xfrm>
+                    <a:prstGeom prst="rect"/>
+                  </pic:spPr>
+                </pic:pic>
+              </a:graphicData>
+            </a:graphic>
+          </wp:inline>
+        </w:drawing>
+      </w:r>
+    </w:p>
+    <w:p>
+      <w:pPr>
+        <w:spacing w:after="140"/>
+        <w:jc w:val="center"/>
+      </w:pPr>
+      <w:r>
+        <w:rPr>
+          <w:i/>
+          <w:sz w:val="18"/>
+        </w:rPr>
+        <w:t>Figure 25: Conflict resolved and pushed</w:t>
+      </w:r>
+    </w:p>
+    <w:p>
+      <w:pPr>
+        <w:spacing w:after="40"/>
+        <w:jc w:val="center"/>
+      </w:pPr>
+      <w:r>
+        <w:drawing>
+          <wp:inline xmlns:a="http://schemas.openxmlformats.org/drawingml/2006/main" xmlns:pic="http://schemas.openxmlformats.org/drawingml/2006/picture">
+            <wp:extent cx="5577840" cy="4327169"/>
+            <wp:docPr id="26" name="Picture 26"/>
+            <wp:cNvGraphicFramePr>
+              <a:graphicFrameLocks noChangeAspect="1"/>
+            </wp:cNvGraphicFramePr>
+            <a:graphic>
+              <a:graphicData uri="http://schemas.openxmlformats.org/drawingml/2006/picture">
+                <pic:pic>
+                  <pic:nvPicPr>
+                    <pic:cNvPr id="0" name="26_task2_merge_history.png"/>
+                    <pic:cNvPicPr/>
+                  </pic:nvPicPr>
+                  <pic:blipFill>
+                    <a:blip r:embed="rId34"/>
+                    <a:stretch>
+                      <a:fillRect/>
+                    </a:stretch>
+                  </pic:blipFill>
+                  <pic:spPr>
+                    <a:xfrm>
+                      <a:off x="0" y="0"/>
+                      <a:ext cx="5577840" cy="4327169"/>
+                    </a:xfrm>
+                    <a:prstGeom prst="rect"/>
+                  </pic:spPr>
+                </pic:pic>
+              </a:graphicData>
+            </a:graphic>
+          </wp:inline>
+        </w:drawing>
+      </w:r>
+    </w:p>
+    <w:p>
+      <w:pPr>
+        <w:spacing w:after="140"/>
+        <w:jc w:val="center"/>
+      </w:pPr>
+      <w:r>
+        <w:rPr>
+          <w:i/>
+          <w:sz w:val="18"/>
+        </w:rPr>
+        <w:t>Figure 26: Task 2 Git history</w:t>
+      </w:r>
+    </w:p>
+    <w:p>
+      <w:pPr>
         <w:pStyle w:val="Heading1"/>
       </w:pPr>
       <w:r>
@@ -1609,7 +1962,7 @@
     </w:p>
     <w:p>
       <w:r>
-        <w:t>Task 1 is complete. The next step is to update the JSON file in RajeshReddy999_new.</w:t>
+        <w:t>Task 1 and Task 2 are complete. Tomorrow I will start Task 3 with master_1 and master_2.</w:t>
       </w:r>
     </w:p>
     <w:sectPr>

</xml_diff>

<commit_message>
Complete Git and GitHub assignment documentation
</commit_message>
<xml_diff>
--- a/assignment4/Git_and_GitHub_Rajesh/Git_and_GitHub_Assignment_Rajesh.docx
+++ b/assignment4/Git_and_GitHub_Rajesh/Git_and_GitHub_Assignment_Rajesh.docx
@@ -1963,6 +1963,765 @@
     <w:p>
       <w:r>
         <w:t>Task 1 and Task 2 are complete. Tomorrow I will start Task 3 with master_1 and master_2.</w:t>
+      </w:r>
+    </w:p>
+    <w:p>
+      <w:pPr>
+        <w:pStyle w:val="Heading1"/>
+      </w:pPr>
+      <w:r>
+        <w:t>Task 3 - Parallel Development</w:t>
+      </w:r>
+    </w:p>
+    <w:p>
+      <w:r>
+        <w:t>I created master_1 and master_2 from main.</w:t>
+      </w:r>
+    </w:p>
+    <w:p>
+      <w:pPr>
+        <w:spacing w:after="80"/>
+        <w:ind w:left="360"/>
+      </w:pPr>
+      <w:r>
+        <w:rPr>
+          <w:rFonts w:ascii="Consolas" w:hAnsi="Consolas"/>
+          <w:sz w:val="18"/>
+        </w:rPr>
+        <w:t>git branch master_1</w:t>
+      </w:r>
+    </w:p>
+    <w:p>
+      <w:pPr>
+        <w:spacing w:after="80"/>
+        <w:ind w:left="360"/>
+      </w:pPr>
+      <w:r>
+        <w:rPr>
+          <w:rFonts w:ascii="Consolas" w:hAnsi="Consolas"/>
+          <w:sz w:val="18"/>
+        </w:rPr>
+        <w:t>git branch master_2</w:t>
+      </w:r>
+    </w:p>
+    <w:p>
+      <w:pPr>
+        <w:spacing w:after="40"/>
+        <w:jc w:val="center"/>
+      </w:pPr>
+      <w:r>
+        <w:drawing>
+          <wp:inline xmlns:a="http://schemas.openxmlformats.org/drawingml/2006/main" xmlns:pic="http://schemas.openxmlformats.org/drawingml/2006/picture">
+            <wp:extent cx="5577840" cy="2509163"/>
+            <wp:docPr id="27" name="Picture 27"/>
+            <wp:cNvGraphicFramePr>
+              <a:graphicFrameLocks noChangeAspect="1"/>
+            </wp:cNvGraphicFramePr>
+            <a:graphic>
+              <a:graphicData uri="http://schemas.openxmlformats.org/drawingml/2006/picture">
+                <pic:pic>
+                  <pic:nvPicPr>
+                    <pic:cNvPr id="0" name="27_master_branches_created.png"/>
+                    <pic:cNvPicPr/>
+                  </pic:nvPicPr>
+                  <pic:blipFill>
+                    <a:blip r:embed="rId35"/>
+                    <a:stretch>
+                      <a:fillRect/>
+                    </a:stretch>
+                  </pic:blipFill>
+                  <pic:spPr>
+                    <a:xfrm>
+                      <a:off x="0" y="0"/>
+                      <a:ext cx="5577840" cy="2509163"/>
+                    </a:xfrm>
+                    <a:prstGeom prst="rect"/>
+                  </pic:spPr>
+                </pic:pic>
+              </a:graphicData>
+            </a:graphic>
+          </wp:inline>
+        </w:drawing>
+      </w:r>
+    </w:p>
+    <w:p>
+      <w:pPr>
+        <w:spacing w:after="140"/>
+        <w:jc w:val="center"/>
+      </w:pPr>
+      <w:r>
+        <w:rPr>
+          <w:i/>
+          <w:sz w:val="18"/>
+        </w:rPr>
+        <w:t>Figure 27: master_1 and master_2 created</w:t>
+      </w:r>
+    </w:p>
+    <w:p>
+      <w:pPr>
+        <w:pStyle w:val="Heading2"/>
+      </w:pPr>
+      <w:r>
+        <w:t>To-Do Page in master_1</w:t>
+      </w:r>
+    </w:p>
+    <w:p>
+      <w:r>
+        <w:t>I made a simple To-Do form with Item Name and Item Description.</w:t>
+      </w:r>
+    </w:p>
+    <w:p>
+      <w:pPr>
+        <w:spacing w:after="40"/>
+        <w:jc w:val="center"/>
+      </w:pPr>
+      <w:r>
+        <w:drawing>
+          <wp:inline xmlns:a="http://schemas.openxmlformats.org/drawingml/2006/main" xmlns:pic="http://schemas.openxmlformats.org/drawingml/2006/picture">
+            <wp:extent cx="5577840" cy="2649908"/>
+            <wp:docPr id="28" name="Picture 28"/>
+            <wp:cNvGraphicFramePr>
+              <a:graphicFrameLocks noChangeAspect="1"/>
+            </wp:cNvGraphicFramePr>
+            <a:graphic>
+              <a:graphicData uri="http://schemas.openxmlformats.org/drawingml/2006/picture">
+                <pic:pic>
+                  <pic:nvPicPr>
+                    <pic:cNvPr id="0" name="28_todo_page.png"/>
+                    <pic:cNvPicPr/>
+                  </pic:nvPicPr>
+                  <pic:blipFill>
+                    <a:blip r:embed="rId36"/>
+                    <a:stretch>
+                      <a:fillRect/>
+                    </a:stretch>
+                  </pic:blipFill>
+                  <pic:spPr>
+                    <a:xfrm>
+                      <a:off x="0" y="0"/>
+                      <a:ext cx="5577840" cy="2649908"/>
+                    </a:xfrm>
+                    <a:prstGeom prst="rect"/>
+                  </pic:spPr>
+                </pic:pic>
+              </a:graphicData>
+            </a:graphic>
+          </wp:inline>
+        </w:drawing>
+      </w:r>
+    </w:p>
+    <w:p>
+      <w:pPr>
+        <w:spacing w:after="140"/>
+        <w:jc w:val="center"/>
+      </w:pPr>
+      <w:r>
+        <w:rPr>
+          <w:i/>
+          <w:sz w:val="18"/>
+        </w:rPr>
+        <w:t>Figure 28: To-Do page</w:t>
+      </w:r>
+    </w:p>
+    <w:p>
+      <w:pPr>
+        <w:spacing w:after="40"/>
+        <w:jc w:val="center"/>
+      </w:pPr>
+      <w:r>
+        <w:drawing>
+          <wp:inline xmlns:a="http://schemas.openxmlformats.org/drawingml/2006/main" xmlns:pic="http://schemas.openxmlformats.org/drawingml/2006/picture">
+            <wp:extent cx="5577840" cy="6892290"/>
+            <wp:docPr id="29" name="Picture 29"/>
+            <wp:cNvGraphicFramePr>
+              <a:graphicFrameLocks noChangeAspect="1"/>
+            </wp:cNvGraphicFramePr>
+            <a:graphic>
+              <a:graphicData uri="http://schemas.openxmlformats.org/drawingml/2006/picture">
+                <pic:pic>
+                  <pic:nvPicPr>
+                    <pic:cNvPr id="0" name="29_master1_todo_commit.png"/>
+                    <pic:cNvPicPr/>
+                  </pic:nvPicPr>
+                  <pic:blipFill>
+                    <a:blip r:embed="rId37"/>
+                    <a:stretch>
+                      <a:fillRect/>
+                    </a:stretch>
+                  </pic:blipFill>
+                  <pic:spPr>
+                    <a:xfrm>
+                      <a:off x="0" y="0"/>
+                      <a:ext cx="5577840" cy="6892290"/>
+                    </a:xfrm>
+                    <a:prstGeom prst="rect"/>
+                  </pic:spPr>
+                </pic:pic>
+              </a:graphicData>
+            </a:graphic>
+          </wp:inline>
+        </w:drawing>
+      </w:r>
+    </w:p>
+    <w:p>
+      <w:pPr>
+        <w:spacing w:after="140"/>
+        <w:jc w:val="center"/>
+      </w:pPr>
+      <w:r>
+        <w:rPr>
+          <w:i/>
+          <w:sz w:val="18"/>
+        </w:rPr>
+        <w:t>Figure 29: To-Do page committed in master_1</w:t>
+      </w:r>
+    </w:p>
+    <w:p>
+      <w:pPr>
+        <w:pStyle w:val="Heading2"/>
+      </w:pPr>
+      <w:r>
+        <w:t>Backend Route in master_2</w:t>
+      </w:r>
+    </w:p>
+    <w:p>
+      <w:r>
+        <w:t>I added /submittodoitem to save the item name and description in MongoDB.</w:t>
+      </w:r>
+    </w:p>
+    <w:p>
+      <w:pPr>
+        <w:spacing w:after="40"/>
+        <w:jc w:val="center"/>
+      </w:pPr>
+      <w:r>
+        <w:drawing>
+          <wp:inline xmlns:a="http://schemas.openxmlformats.org/drawingml/2006/main" xmlns:pic="http://schemas.openxmlformats.org/drawingml/2006/picture">
+            <wp:extent cx="5577840" cy="4632549"/>
+            <wp:docPr id="30" name="Picture 30"/>
+            <wp:cNvGraphicFramePr>
+              <a:graphicFrameLocks noChangeAspect="1"/>
+            </wp:cNvGraphicFramePr>
+            <a:graphic>
+              <a:graphicData uri="http://schemas.openxmlformats.org/drawingml/2006/picture">
+                <pic:pic>
+                  <pic:nvPicPr>
+                    <pic:cNvPr id="0" name="30_submittodoitem_route.png"/>
+                    <pic:cNvPicPr/>
+                  </pic:nvPicPr>
+                  <pic:blipFill>
+                    <a:blip r:embed="rId38"/>
+                    <a:stretch>
+                      <a:fillRect/>
+                    </a:stretch>
+                  </pic:blipFill>
+                  <pic:spPr>
+                    <a:xfrm>
+                      <a:off x="0" y="0"/>
+                      <a:ext cx="5577840" cy="4632549"/>
+                    </a:xfrm>
+                    <a:prstGeom prst="rect"/>
+                  </pic:spPr>
+                </pic:pic>
+              </a:graphicData>
+            </a:graphic>
+          </wp:inline>
+        </w:drawing>
+      </w:r>
+    </w:p>
+    <w:p>
+      <w:pPr>
+        <w:spacing w:after="140"/>
+        <w:jc w:val="center"/>
+      </w:pPr>
+      <w:r>
+        <w:rPr>
+          <w:i/>
+          <w:sz w:val="18"/>
+        </w:rPr>
+        <w:t>Figure 30: /submittodoitem route</w:t>
+      </w:r>
+    </w:p>
+    <w:p>
+      <w:pPr>
+        <w:spacing w:after="40"/>
+        <w:jc w:val="center"/>
+      </w:pPr>
+      <w:r>
+        <w:drawing>
+          <wp:inline xmlns:a="http://schemas.openxmlformats.org/drawingml/2006/main" xmlns:pic="http://schemas.openxmlformats.org/drawingml/2006/picture">
+            <wp:extent cx="5577840" cy="4610785"/>
+            <wp:docPr id="31" name="Picture 31"/>
+            <wp:cNvGraphicFramePr>
+              <a:graphicFrameLocks noChangeAspect="1"/>
+            </wp:cNvGraphicFramePr>
+            <a:graphic>
+              <a:graphicData uri="http://schemas.openxmlformats.org/drawingml/2006/picture">
+                <pic:pic>
+                  <pic:nvPicPr>
+                    <pic:cNvPr id="0" name="31_master2_backend_commit.png"/>
+                    <pic:cNvPicPr/>
+                  </pic:nvPicPr>
+                  <pic:blipFill>
+                    <a:blip r:embed="rId39"/>
+                    <a:stretch>
+                      <a:fillRect/>
+                    </a:stretch>
+                  </pic:blipFill>
+                  <pic:spPr>
+                    <a:xfrm>
+                      <a:off x="0" y="0"/>
+                      <a:ext cx="5577840" cy="4610785"/>
+                    </a:xfrm>
+                    <a:prstGeom prst="rect"/>
+                  </pic:spPr>
+                </pic:pic>
+              </a:graphicData>
+            </a:graphic>
+          </wp:inline>
+        </w:drawing>
+      </w:r>
+    </w:p>
+    <w:p>
+      <w:pPr>
+        <w:spacing w:after="140"/>
+        <w:jc w:val="center"/>
+      </w:pPr>
+      <w:r>
+        <w:rPr>
+          <w:i/>
+          <w:sz w:val="18"/>
+        </w:rPr>
+        <w:t>Figure 31: Backend route committed in master_2</w:t>
+      </w:r>
+    </w:p>
+    <w:p>
+      <w:pPr>
+        <w:pStyle w:val="Heading2"/>
+      </w:pPr>
+      <w:r>
+        <w:t>Merge Task 3 Branches</w:t>
+      </w:r>
+    </w:p>
+    <w:p>
+      <w:pPr>
+        <w:spacing w:after="80"/>
+        <w:ind w:left="360"/>
+      </w:pPr>
+      <w:r>
+        <w:rPr>
+          <w:rFonts w:ascii="Consolas" w:hAnsi="Consolas"/>
+          <w:sz w:val="18"/>
+        </w:rPr>
+        <w:t>git merge master_1 -m "Merge To-Do frontend"</w:t>
+      </w:r>
+    </w:p>
+    <w:p>
+      <w:pPr>
+        <w:spacing w:after="80"/>
+        <w:ind w:left="360"/>
+      </w:pPr>
+      <w:r>
+        <w:rPr>
+          <w:rFonts w:ascii="Consolas" w:hAnsi="Consolas"/>
+          <w:sz w:val="18"/>
+        </w:rPr>
+        <w:t>git merge master_2 -m "Merge To-Do backend"</w:t>
+      </w:r>
+    </w:p>
+    <w:p>
+      <w:pPr>
+        <w:spacing w:after="40"/>
+        <w:jc w:val="center"/>
+      </w:pPr>
+      <w:r>
+        <w:drawing>
+          <wp:inline xmlns:a="http://schemas.openxmlformats.org/drawingml/2006/main" xmlns:pic="http://schemas.openxmlformats.org/drawingml/2006/picture">
+            <wp:extent cx="5577840" cy="3967742"/>
+            <wp:docPr id="32" name="Picture 32"/>
+            <wp:cNvGraphicFramePr>
+              <a:graphicFrameLocks noChangeAspect="1"/>
+            </wp:cNvGraphicFramePr>
+            <a:graphic>
+              <a:graphicData uri="http://schemas.openxmlformats.org/drawingml/2006/picture">
+                <pic:pic>
+                  <pic:nvPicPr>
+                    <pic:cNvPr id="0" name="32_task3_merge_history.png"/>
+                    <pic:cNvPicPr/>
+                  </pic:nvPicPr>
+                  <pic:blipFill>
+                    <a:blip r:embed="rId40"/>
+                    <a:stretch>
+                      <a:fillRect/>
+                    </a:stretch>
+                  </pic:blipFill>
+                  <pic:spPr>
+                    <a:xfrm>
+                      <a:off x="0" y="0"/>
+                      <a:ext cx="5577840" cy="3967742"/>
+                    </a:xfrm>
+                    <a:prstGeom prst="rect"/>
+                  </pic:spPr>
+                </pic:pic>
+              </a:graphicData>
+            </a:graphic>
+          </wp:inline>
+        </w:drawing>
+      </w:r>
+    </w:p>
+    <w:p>
+      <w:pPr>
+        <w:spacing w:after="140"/>
+        <w:jc w:val="center"/>
+      </w:pPr>
+      <w:r>
+        <w:rPr>
+          <w:i/>
+          <w:sz w:val="18"/>
+        </w:rPr>
+        <w:t>Figure 32: Task 3 merge history</w:t>
+      </w:r>
+    </w:p>
+    <w:p>
+      <w:pPr>
+        <w:pStyle w:val="Heading1"/>
+      </w:pPr>
+      <w:r>
+        <w:t>Task 4 - Commits, Reset and Rebase</w:t>
+      </w:r>
+    </w:p>
+    <w:p>
+      <w:r>
+        <w:t>I added Item ID, Item UUID, and Item Hash in three separate commits.</w:t>
+      </w:r>
+    </w:p>
+    <w:p>
+      <w:pPr>
+        <w:spacing w:after="80"/>
+        <w:ind w:left="360"/>
+      </w:pPr>
+      <w:r>
+        <w:rPr>
+          <w:rFonts w:ascii="Consolas" w:hAnsi="Consolas"/>
+          <w:sz w:val="18"/>
+        </w:rPr>
+        <w:t>git commit -m "Add Item ID field"</w:t>
+      </w:r>
+    </w:p>
+    <w:p>
+      <w:pPr>
+        <w:spacing w:after="80"/>
+        <w:ind w:left="360"/>
+      </w:pPr>
+      <w:r>
+        <w:rPr>
+          <w:rFonts w:ascii="Consolas" w:hAnsi="Consolas"/>
+          <w:sz w:val="18"/>
+        </w:rPr>
+        <w:t>git commit -m "Add Item UUID field"</w:t>
+      </w:r>
+    </w:p>
+    <w:p>
+      <w:pPr>
+        <w:spacing w:after="80"/>
+        <w:ind w:left="360"/>
+      </w:pPr>
+      <w:r>
+        <w:rPr>
+          <w:rFonts w:ascii="Consolas" w:hAnsi="Consolas"/>
+          <w:sz w:val="18"/>
+        </w:rPr>
+        <w:t>git commit -m "Add Item Hash field"</w:t>
+      </w:r>
+    </w:p>
+    <w:p>
+      <w:pPr>
+        <w:spacing w:after="40"/>
+        <w:jc w:val="center"/>
+      </w:pPr>
+      <w:r>
+        <w:drawing>
+          <wp:inline xmlns:a="http://schemas.openxmlformats.org/drawingml/2006/main" xmlns:pic="http://schemas.openxmlformats.org/drawingml/2006/picture">
+            <wp:extent cx="5577840" cy="2546405"/>
+            <wp:docPr id="33" name="Picture 33"/>
+            <wp:cNvGraphicFramePr>
+              <a:graphicFrameLocks noChangeAspect="1"/>
+            </wp:cNvGraphicFramePr>
+            <a:graphic>
+              <a:graphicData uri="http://schemas.openxmlformats.org/drawingml/2006/picture">
+                <pic:pic>
+                  <pic:nvPicPr>
+                    <pic:cNvPr id="0" name="33_three_field_commits.png"/>
+                    <pic:cNvPicPr/>
+                  </pic:nvPicPr>
+                  <pic:blipFill>
+                    <a:blip r:embed="rId41"/>
+                    <a:stretch>
+                      <a:fillRect/>
+                    </a:stretch>
+                  </pic:blipFill>
+                  <pic:spPr>
+                    <a:xfrm>
+                      <a:off x="0" y="0"/>
+                      <a:ext cx="5577840" cy="2546405"/>
+                    </a:xfrm>
+                    <a:prstGeom prst="rect"/>
+                  </pic:spPr>
+                </pic:pic>
+              </a:graphicData>
+            </a:graphic>
+          </wp:inline>
+        </w:drawing>
+      </w:r>
+    </w:p>
+    <w:p>
+      <w:pPr>
+        <w:spacing w:after="140"/>
+        <w:jc w:val="center"/>
+      </w:pPr>
+      <w:r>
+        <w:rPr>
+          <w:i/>
+          <w:sz w:val="18"/>
+        </w:rPr>
+        <w:t>Figure 33: Three separate field commits</w:t>
+      </w:r>
+    </w:p>
+    <w:p>
+      <w:pPr>
+        <w:spacing w:after="40"/>
+        <w:jc w:val="center"/>
+      </w:pPr>
+      <w:r>
+        <w:drawing>
+          <wp:inline xmlns:a="http://schemas.openxmlformats.org/drawingml/2006/main" xmlns:pic="http://schemas.openxmlformats.org/drawingml/2006/picture">
+            <wp:extent cx="5577840" cy="5393640"/>
+            <wp:docPr id="34" name="Picture 34"/>
+            <wp:cNvGraphicFramePr>
+              <a:graphicFrameLocks noChangeAspect="1"/>
+            </wp:cNvGraphicFramePr>
+            <a:graphic>
+              <a:graphicData uri="http://schemas.openxmlformats.org/drawingml/2006/picture">
+                <pic:pic>
+                  <pic:nvPicPr>
+                    <pic:cNvPr id="0" name="34_master1_fields_merged.png"/>
+                    <pic:cNvPicPr/>
+                  </pic:nvPicPr>
+                  <pic:blipFill>
+                    <a:blip r:embed="rId42"/>
+                    <a:stretch>
+                      <a:fillRect/>
+                    </a:stretch>
+                  </pic:blipFill>
+                  <pic:spPr>
+                    <a:xfrm>
+                      <a:off x="0" y="0"/>
+                      <a:ext cx="5577840" cy="5393640"/>
+                    </a:xfrm>
+                    <a:prstGeom prst="rect"/>
+                  </pic:spPr>
+                </pic:pic>
+              </a:graphicData>
+            </a:graphic>
+          </wp:inline>
+        </w:drawing>
+      </w:r>
+    </w:p>
+    <w:p>
+      <w:pPr>
+        <w:spacing w:after="140"/>
+        <w:jc w:val="center"/>
+      </w:pPr>
+      <w:r>
+        <w:rPr>
+          <w:i/>
+          <w:sz w:val="18"/>
+        </w:rPr>
+        <w:t>Figure 34: Field commits merged into main</w:t>
+      </w:r>
+    </w:p>
+    <w:p>
+      <w:pPr>
+        <w:pStyle w:val="Heading2"/>
+      </w:pPr>
+      <w:r>
+        <w:t>Soft Reset</w:t>
+      </w:r>
+    </w:p>
+    <w:p>
+      <w:r>
+        <w:t>I used a soft reset to move main back to the Item ID commit. The later changes stayed staged.</w:t>
+      </w:r>
+    </w:p>
+    <w:p>
+      <w:pPr>
+        <w:spacing w:after="80"/>
+        <w:ind w:left="360"/>
+      </w:pPr>
+      <w:r>
+        <w:rPr>
+          <w:rFonts w:ascii="Consolas" w:hAnsi="Consolas"/>
+          <w:sz w:val="18"/>
+        </w:rPr>
+        <w:t>git reset --soft 0c3b6b5</w:t>
+      </w:r>
+    </w:p>
+    <w:p>
+      <w:pPr>
+        <w:spacing w:after="40"/>
+        <w:jc w:val="center"/>
+      </w:pPr>
+      <w:r>
+        <w:drawing>
+          <wp:inline xmlns:a="http://schemas.openxmlformats.org/drawingml/2006/main" xmlns:pic="http://schemas.openxmlformats.org/drawingml/2006/picture">
+            <wp:extent cx="5577840" cy="5260261"/>
+            <wp:docPr id="35" name="Picture 35"/>
+            <wp:cNvGraphicFramePr>
+              <a:graphicFrameLocks noChangeAspect="1"/>
+            </wp:cNvGraphicFramePr>
+            <a:graphic>
+              <a:graphicData uri="http://schemas.openxmlformats.org/drawingml/2006/picture">
+                <pic:pic>
+                  <pic:nvPicPr>
+                    <pic:cNvPr id="0" name="35_soft_reset_staged_changes.png"/>
+                    <pic:cNvPicPr/>
+                  </pic:nvPicPr>
+                  <pic:blipFill>
+                    <a:blip r:embed="rId43"/>
+                    <a:stretch>
+                      <a:fillRect/>
+                    </a:stretch>
+                  </pic:blipFill>
+                  <pic:spPr>
+                    <a:xfrm>
+                      <a:off x="0" y="0"/>
+                      <a:ext cx="5577840" cy="5260261"/>
+                    </a:xfrm>
+                    <a:prstGeom prst="rect"/>
+                  </pic:spPr>
+                </pic:pic>
+              </a:graphicData>
+            </a:graphic>
+          </wp:inline>
+        </w:drawing>
+      </w:r>
+    </w:p>
+    <w:p>
+      <w:pPr>
+        <w:spacing w:after="140"/>
+        <w:jc w:val="center"/>
+      </w:pPr>
+      <w:r>
+        <w:rPr>
+          <w:i/>
+          <w:sz w:val="18"/>
+        </w:rPr>
+        <w:t>Figure 35: Changes remained staged after soft reset</w:t>
+      </w:r>
+    </w:p>
+    <w:p>
+      <w:pPr>
+        <w:spacing w:after="40"/>
+        <w:jc w:val="center"/>
+      </w:pPr>
+      <w:r>
+        <w:drawing>
+          <wp:inline xmlns:a="http://schemas.openxmlformats.org/drawingml/2006/main" xmlns:pic="http://schemas.openxmlformats.org/drawingml/2006/picture">
+            <wp:extent cx="5577840" cy="1546218"/>
+            <wp:docPr id="36" name="Picture 36"/>
+            <wp:cNvGraphicFramePr>
+              <a:graphicFrameLocks noChangeAspect="1"/>
+            </wp:cNvGraphicFramePr>
+            <a:graphic>
+              <a:graphicData uri="http://schemas.openxmlformats.org/drawingml/2006/picture">
+                <pic:pic>
+                  <pic:nvPicPr>
+                    <pic:cNvPr id="0" name="36_main_reset_to_item_id.png"/>
+                    <pic:cNvPicPr/>
+                  </pic:nvPicPr>
+                  <pic:blipFill>
+                    <a:blip r:embed="rId44"/>
+                    <a:stretch>
+                      <a:fillRect/>
+                    </a:stretch>
+                  </pic:blipFill>
+                  <pic:spPr>
+                    <a:xfrm>
+                      <a:off x="0" y="0"/>
+                      <a:ext cx="5577840" cy="1546218"/>
+                    </a:xfrm>
+                    <a:prstGeom prst="rect"/>
+                  </pic:spPr>
+                </pic:pic>
+              </a:graphicData>
+            </a:graphic>
+          </wp:inline>
+        </w:drawing>
+      </w:r>
+    </w:p>
+    <w:p>
+      <w:pPr>
+        <w:spacing w:after="140"/>
+        <w:jc w:val="center"/>
+      </w:pPr>
+      <w:r>
+        <w:rPr>
+          <w:i/>
+          <w:sz w:val="18"/>
+        </w:rPr>
+        <w:t>Figure 36: Main moved to the Item ID commit</w:t>
+      </w:r>
+    </w:p>
+    <w:p>
+      <w:pPr>
+        <w:pStyle w:val="Heading2"/>
+      </w:pPr>
+      <w:r>
+        <w:t>Re-commit and Rebase</w:t>
+      </w:r>
+    </w:p>
+    <w:p>
+      <w:r>
+        <w:t>I re-committed the Item ID state and rebased main onto master_1. The UUID and Hash commits stayed separate.</w:t>
+      </w:r>
+    </w:p>
+    <w:p>
+      <w:pPr>
+        <w:spacing w:after="80"/>
+        <w:ind w:left="360"/>
+      </w:pPr>
+      <w:r>
+        <w:rPr>
+          <w:rFonts w:ascii="Consolas" w:hAnsi="Consolas"/>
+          <w:sz w:val="18"/>
+        </w:rPr>
+        <w:t>git commit --allow-empty -m "Recommit Item ID state after soft reset"</w:t>
+      </w:r>
+    </w:p>
+    <w:p>
+      <w:pPr>
+        <w:spacing w:after="80"/>
+        <w:ind w:left="360"/>
+      </w:pPr>
+      <w:r>
+        <w:rPr>
+          <w:rFonts w:ascii="Consolas" w:hAnsi="Consolas"/>
+          <w:sz w:val="18"/>
+        </w:rPr>
+        <w:t>git rebase main master_1</w:t>
+      </w:r>
+    </w:p>
+    <w:p>
+      <w:pPr>
+        <w:pStyle w:val="Heading1"/>
+      </w:pPr>
+      <w:r>
+        <w:t>Current Progress</w:t>
+      </w:r>
+    </w:p>
+    <w:p>
+      <w:r>
+        <w:t>All coding and local Git tasks are complete. The final GitHub update and submission ZIP are pending.</w:t>
       </w:r>
     </w:p>
     <w:sectPr>

</xml_diff>